<commit_message>
Remove tenant reference, internal best-practices doc, and cloud/API Task details
- Drop AA_PACKAGE_BEST_PRACTICES.md: generic internal package-dev guidance,
  not specific to this package.
- Remove the aa-training-sbx tenant reference from the README.
- Strip HEADLESS/ONDEMAND_CLOUD/API Task/signing details from the README
  and docx: this package only ever targets Windows/macOS TaskBots, so
  cloud-runner restrictions are irrelevant noise for a reader here.

Co-Authored-By: Claude Sonnet 5 <noreply@anthropic.com>
</commit_message>
<xml_diff>
--- a/TypeSafe-Package-Documentation.docx
+++ b/TypeSafe-Package-Documentation.docx
@@ -1054,92 +1054,6 @@
                 <w:szCs w:val="20"/>
               </w:rPr>
               <w:t xml:space="preserve">Bot Agent, standard TaskBot</w:t>
-            </w:r>
-          </w:p>
-        </w:tc>
-      </w:tr>
-      <w:tr>
-        <w:tc>
-          <w:tcPr>
-            <w:tcW w:type="dxa" w:w="3168"/>
-            <w:tcBorders>
-              <w:top w:val="single" w:color="CCCCCC" w:sz="4"/>
-              <w:left w:val="single" w:color="CCCCCC" w:sz="4"/>
-              <w:bottom w:val="single" w:color="CCCCCC" w:sz="4"/>
-              <w:right w:val="single" w:color="CCCCCC" w:sz="4"/>
-            </w:tcBorders>
-            <w:shd w:fill="FFFFFF" w:color="auto" w:val="clear"/>
-            <w:tcMar>
-              <w:top w:type="dxa" w:w="80"/>
-              <w:left w:type="dxa" w:w="120"/>
-              <w:bottom w:type="dxa" w:w="80"/>
-              <w:right w:type="dxa" w:w="120"/>
-            </w:tcMar>
-          </w:tcPr>
-          <w:p>
-            <w:r>
-              <w:rPr>
-                <w:rFonts w:ascii="Arial" w:cs="Arial" w:eastAsia="Arial" w:hAnsi="Arial"/>
-                <w:sz w:val="20"/>
-                <w:szCs w:val="20"/>
-              </w:rPr>
-              <w:t xml:space="preserve">Headless / Cloud (API Task)</w:t>
-            </w:r>
-          </w:p>
-        </w:tc>
-        <w:tc>
-          <w:tcPr>
-            <w:tcW w:type="dxa" w:w="1800"/>
-            <w:tcBorders>
-              <w:top w:val="single" w:color="CCCCCC" w:sz="4"/>
-              <w:left w:val="single" w:color="CCCCCC" w:sz="4"/>
-              <w:bottom w:val="single" w:color="CCCCCC" w:sz="4"/>
-              <w:right w:val="single" w:color="CCCCCC" w:sz="4"/>
-            </w:tcBorders>
-            <w:shd w:fill="FFFFFF" w:color="auto" w:val="clear"/>
-            <w:tcMar>
-              <w:top w:type="dxa" w:w="80"/>
-              <w:left w:type="dxa" w:w="120"/>
-              <w:bottom w:type="dxa" w:w="80"/>
-              <w:right w:type="dxa" w:w="120"/>
-            </w:tcMar>
-          </w:tcPr>
-          <w:p>
-            <w:r>
-              <w:rPr>
-                <w:rFonts w:ascii="Arial" w:cs="Arial" w:eastAsia="Arial" w:hAnsi="Arial"/>
-                <w:sz w:val="20"/>
-                <w:szCs w:val="20"/>
-              </w:rPr>
-              <w:t xml:space="preserve">No</w:t>
-            </w:r>
-          </w:p>
-        </w:tc>
-        <w:tc>
-          <w:tcPr>
-            <w:tcW w:type="dxa" w:w="4392"/>
-            <w:tcBorders>
-              <w:top w:val="single" w:color="CCCCCC" w:sz="4"/>
-              <w:left w:val="single" w:color="CCCCCC" w:sz="4"/>
-              <w:bottom w:val="single" w:color="CCCCCC" w:sz="4"/>
-              <w:right w:val="single" w:color="CCCCCC" w:sz="4"/>
-            </w:tcBorders>
-            <w:shd w:fill="FFFFFF" w:color="auto" w:val="clear"/>
-            <w:tcMar>
-              <w:top w:type="dxa" w:w="80"/>
-              <w:left w:type="dxa" w:w="120"/>
-              <w:bottom w:type="dxa" w:w="80"/>
-              <w:right w:type="dxa" w:w="120"/>
-            </w:tcMar>
-          </w:tcPr>
-          <w:p>
-            <w:r>
-              <w:rPr>
-                <w:rFonts w:ascii="Arial" w:cs="Arial" w:eastAsia="Arial" w:hAnsi="Arial"/>
-                <w:sz w:val="20"/>
-                <w:szCs w:val="20"/>
-              </w:rPr>
-              <w:t xml:space="preserve">Custom packages cannot target HEADLESS or ONDEMAND_CLOUD — see §6.3</w:t>
             </w:r>
           </w:p>
         </w:tc>
@@ -6284,7 +6198,7 @@
           <w:sz w:val="26"/>
           <w:szCs w:val="26"/>
         </w:rPr>
-        <w:t xml:space="preserve">6.3 Security &amp; Deployment</w:t>
+        <w:t xml:space="preserve">6.3 Security</w:t>
       </w:r>
     </w:p>
     <w:p>
@@ -6320,24 +6234,6 @@
           <w:sz w:val="21"/>
           <w:szCs w:val="21"/>
         </w:rPr>
-        <w:t xml:space="preserve">Custom packages can only target Windows and macOS Bot Agents. Headless/Cloud (API Task, ONDEMAND_CLOUD) requires a jar signed by the Automation Anywhere product team, which is not available to custom package authors — attempting to install a custom package with those targets fails with package.invalid.signature.</w:t>
-      </w:r>
-    </w:p>
-    <w:p>
-      <w:pPr>
-        <w:pStyle w:val="ListParagraph"/>
-        <w:numPr>
-          <w:ilvl w:val="0"/>
-          <w:numId w:val="1"/>
-        </w:numPr>
-        <w:spacing w:after="60"/>
-      </w:pPr>
-      <w:r>
-        <w:rPr>
-          <w:rFonts w:ascii="Arial" w:cs="Arial" w:eastAsia="Arial" w:hAnsi="Arial"/>
-          <w:sz w:val="21"/>
-          <w:szCs w:val="21"/>
-        </w:rPr>
         <w:t xml:space="preserve">Text sent to Evaluate* actions leaves the Bot Agent machine over HTTPS to api.typesafe.ai — treat this the same as any other external API call for data-handling and compliance purposes.</w:t>
       </w:r>
     </w:p>
@@ -6429,34 +6325,6 @@
           <w:szCs w:val="21"/>
         </w:rPr>
         <w:t xml:space="preserve">A: Jev's output tokens are not billed. billable_tokens is provided so a bot can sum real cost without having to know that rule.</w:t>
-      </w:r>
-    </w:p>
-    <w:p>
-      <w:pPr>
-        <w:spacing w:after="120"/>
-      </w:pPr>
-      <w:r>
-        <w:rPr>
-          <w:rFonts w:ascii="Arial" w:cs="Arial" w:eastAsia="Arial" w:hAnsi="Arial"/>
-          <w:b/>
-          <w:bCs/>
-          <w:sz w:val="21"/>
-          <w:szCs w:val="21"/>
-        </w:rPr>
-        <w:t xml:space="preserve">Q: Can this run in a cloud/headless automation?</w:t>
-      </w:r>
-    </w:p>
-    <w:p>
-      <w:pPr>
-        <w:spacing w:after="120"/>
-      </w:pPr>
-      <w:r>
-        <w:rPr>
-          <w:rFonts w:ascii="Arial" w:cs="Arial" w:eastAsia="Arial" w:hAnsi="Arial"/>
-          <w:sz w:val="21"/>
-          <w:szCs w:val="21"/>
-        </w:rPr>
-        <w:t xml:space="preserve">A: No — see §6.3. Custom packages are restricted to Windows/macOS TaskBots.</w:t>
       </w:r>
     </w:p>
     <w:p>
@@ -6762,92 +6630,6 @@
                 <w:szCs w:val="20"/>
               </w:rPr>
               <w:t xml:space="preserve">Confirm outbound HTTPS access to api.typesafe.ai</w:t>
-            </w:r>
-          </w:p>
-        </w:tc>
-      </w:tr>
-      <w:tr>
-        <w:tc>
-          <w:tcPr>
-            <w:tcW w:type="dxa" w:w="2800"/>
-            <w:tcBorders>
-              <w:top w:val="single" w:color="CCCCCC" w:sz="4"/>
-              <w:left w:val="single" w:color="CCCCCC" w:sz="4"/>
-              <w:bottom w:val="single" w:color="CCCCCC" w:sz="4"/>
-              <w:right w:val="single" w:color="CCCCCC" w:sz="4"/>
-            </w:tcBorders>
-            <w:shd w:fill="FFFFFF" w:color="auto" w:val="clear"/>
-            <w:tcMar>
-              <w:top w:type="dxa" w:w="80"/>
-              <w:left w:type="dxa" w:w="120"/>
-              <w:bottom w:type="dxa" w:w="80"/>
-              <w:right w:type="dxa" w:w="120"/>
-            </w:tcMar>
-          </w:tcPr>
-          <w:p>
-            <w:r>
-              <w:rPr>
-                <w:rFonts w:ascii="Arial" w:cs="Arial" w:eastAsia="Arial" w:hAnsi="Arial"/>
-                <w:sz w:val="20"/>
-                <w:szCs w:val="20"/>
-              </w:rPr>
-              <w:t xml:space="preserve">package.invalid.signature on install</w:t>
-            </w:r>
-          </w:p>
-        </w:tc>
-        <w:tc>
-          <w:tcPr>
-            <w:tcW w:type="dxa" w:w="3000"/>
-            <w:tcBorders>
-              <w:top w:val="single" w:color="CCCCCC" w:sz="4"/>
-              <w:left w:val="single" w:color="CCCCCC" w:sz="4"/>
-              <w:bottom w:val="single" w:color="CCCCCC" w:sz="4"/>
-              <w:right w:val="single" w:color="CCCCCC" w:sz="4"/>
-            </w:tcBorders>
-            <w:shd w:fill="FFFFFF" w:color="auto" w:val="clear"/>
-            <w:tcMar>
-              <w:top w:type="dxa" w:w="80"/>
-              <w:left w:type="dxa" w:w="120"/>
-              <w:bottom w:type="dxa" w:w="80"/>
-              <w:right w:type="dxa" w:w="120"/>
-            </w:tcMar>
-          </w:tcPr>
-          <w:p>
-            <w:r>
-              <w:rPr>
-                <w:rFonts w:ascii="Arial" w:cs="Arial" w:eastAsia="Arial" w:hAnsi="Arial"/>
-                <w:sz w:val="20"/>
-                <w:szCs w:val="20"/>
-              </w:rPr>
-              <w:t xml:space="preserve">Package targets Headless/Cloud</w:t>
-            </w:r>
-          </w:p>
-        </w:tc>
-        <w:tc>
-          <w:tcPr>
-            <w:tcW w:type="dxa" w:w="3560"/>
-            <w:tcBorders>
-              <w:top w:val="single" w:color="CCCCCC" w:sz="4"/>
-              <w:left w:val="single" w:color="CCCCCC" w:sz="4"/>
-              <w:bottom w:val="single" w:color="CCCCCC" w:sz="4"/>
-              <w:right w:val="single" w:color="CCCCCC" w:sz="4"/>
-            </w:tcBorders>
-            <w:shd w:fill="FFFFFF" w:color="auto" w:val="clear"/>
-            <w:tcMar>
-              <w:top w:type="dxa" w:w="80"/>
-              <w:left w:type="dxa" w:w="120"/>
-              <w:bottom w:type="dxa" w:w="80"/>
-              <w:right w:type="dxa" w:w="120"/>
-            </w:tcMar>
-          </w:tcPr>
-          <w:p>
-            <w:r>
-              <w:rPr>
-                <w:rFonts w:ascii="Arial" w:cs="Arial" w:eastAsia="Arial" w:hAnsi="Arial"/>
-                <w:sz w:val="20"/>
-                <w:szCs w:val="20"/>
-              </w:rPr>
-              <w:t xml:space="preserve">Custom packages must target Windows/macOS only — see §6.3</w:t>
             </w:r>
           </w:p>
         </w:tc>

</xml_diff>